<commit_message>
LayoutIQ UX, georef DXF (PVM_Tr layers), report section, and manual v1.1
Georeferenced layout DXF with PVM_ layers and overlaid strings+trackers; compare FT/SAT sweep, custom GCR input, scroll-to-top on runs, LayoutIQ PDF section, and Professional engineering manual download in React.

Co-authored-by: Cursor <cursoragent@cursor.com>
</commit_message>
<xml_diff>
--- a/docs/PVMath_Engineering_Reference_Manual_PUBLIC.docx
+++ b/docs/PVMath_Engineering_Reference_Manual_PUBLIC.docx
@@ -50,7 +50,7 @@
           <w:color w:val="505050"/>
           <w:sz w:val="24"/>
         </w:rPr>
-        <w:t>Version 1.0  ·  June 2026</w:t>
+        <w:t>Version 1.1  ·  June 2026 (LayoutIQ update)</w:t>
       </w:r>
     </w:p>
     <w:p/>
@@ -316,7 +316,7 @@
         <w:ind w:left="504"/>
       </w:pPr>
       <w:r>
-        <w:t>GCR</w:t>
+        <w:t>GCR sweep &amp; optimization mode</w:t>
       </w:r>
     </w:p>
     <w:p>
@@ -325,7 +325,7 @@
         <w:ind w:left="504"/>
       </w:pPr>
       <w:r>
-        <w:t>MWp/ha</w:t>
+        <w:t>Tracker azimuth</w:t>
       </w:r>
     </w:p>
     <w:p>
@@ -334,7 +334,7 @@
         <w:ind w:left="504"/>
       </w:pPr>
       <w:r>
-        <w:t>1P/2P portrait</w:t>
+        <w:t>Alignment guide</w:t>
       </w:r>
     </w:p>
     <w:p>
@@ -343,7 +343,7 @@
         <w:ind w:left="504"/>
       </w:pPr>
       <w:r>
-        <w:t>Agri-PV density</w:t>
+        <w:t>Compare Fixed &amp; Tracker</w:t>
       </w:r>
     </w:p>
     <w:p>
@@ -352,18 +352,7 @@
         <w:ind w:left="504"/>
       </w:pPr>
       <w:r>
-        <w:t>GIS buildable area</w:t>
-      </w:r>
-    </w:p>
-    <w:p>
-      <w:pPr>
-        <w:pStyle w:val="ListNumber"/>
-      </w:pPr>
-      <w:r>
-        <w:rPr>
-          <w:b/>
-        </w:rPr>
-        <w:t>5. GIS, CAD &amp; Export Formats</w:t>
+        <w:t>MWp/ha</w:t>
       </w:r>
     </w:p>
     <w:p>
@@ -372,7 +361,7 @@
         <w:ind w:left="504"/>
       </w:pPr>
       <w:r>
-        <w:t>LandXML</w:t>
+        <w:t>1P/2P portrait</w:t>
       </w:r>
     </w:p>
     <w:p>
@@ -381,7 +370,7 @@
         <w:ind w:left="504"/>
       </w:pPr>
       <w:r>
-        <w:t>DXF</w:t>
+        <w:t>Layout DXF (PVM_ layers)</w:t>
       </w:r>
     </w:p>
     <w:p>
@@ -390,7 +379,18 @@
         <w:ind w:left="504"/>
       </w:pPr>
       <w:r>
-        <w:t>UTM/EPSG</w:t>
+        <w:t>GIS buildable area</w:t>
+      </w:r>
+    </w:p>
+    <w:p>
+      <w:pPr>
+        <w:pStyle w:val="ListNumber"/>
+      </w:pPr>
+      <w:r>
+        <w:rPr>
+          <w:b/>
+        </w:rPr>
+        <w:t>5. GIS, CAD &amp; Export Formats</w:t>
       </w:r>
     </w:p>
     <w:p>
@@ -399,18 +399,7 @@
         <w:ind w:left="504"/>
       </w:pPr>
       <w:r>
-        <w:t>SITE_BOUNDARY</w:t>
-      </w:r>
-    </w:p>
-    <w:p>
-      <w:pPr>
-        <w:pStyle w:val="ListNumber"/>
-      </w:pPr>
-      <w:r>
-        <w:rPr>
-          <w:b/>
-        </w:rPr>
-        <w:t>6. Data Sources &amp; APIs</w:t>
+        <w:t>LandXML</w:t>
       </w:r>
     </w:p>
     <w:p>
@@ -419,7 +408,7 @@
         <w:ind w:left="504"/>
       </w:pPr>
       <w:r>
-        <w:t>PVGIS</w:t>
+        <w:t>DXF</w:t>
       </w:r>
     </w:p>
     <w:p>
@@ -428,7 +417,7 @@
         <w:ind w:left="504"/>
       </w:pPr>
       <w:r>
-        <w:t>OpenTopoData</w:t>
+        <w:t>UTM/EPSG</w:t>
       </w:r>
     </w:p>
     <w:p>
@@ -437,7 +426,18 @@
         <w:ind w:left="504"/>
       </w:pPr>
       <w:r>
-        <w:t>AWS Terrarium tiles</w:t>
+        <w:t>SITE_BOUNDARY</w:t>
+      </w:r>
+    </w:p>
+    <w:p>
+      <w:pPr>
+        <w:pStyle w:val="ListNumber"/>
+      </w:pPr>
+      <w:r>
+        <w:rPr>
+          <w:b/>
+        </w:rPr>
+        <w:t>6. Data Sources &amp; APIs</w:t>
       </w:r>
     </w:p>
     <w:p>
@@ -446,18 +446,7 @@
         <w:ind w:left="504"/>
       </w:pPr>
       <w:r>
-        <w:t>Nominatim</w:t>
-      </w:r>
-    </w:p>
-    <w:p>
-      <w:pPr>
-        <w:pStyle w:val="ListNumber"/>
-      </w:pPr>
-      <w:r>
-        <w:rPr>
-          <w:b/>
-        </w:rPr>
-        <w:t>7. Report Metrics &amp; PDF Fields</w:t>
+        <w:t>PVGIS</w:t>
       </w:r>
     </w:p>
     <w:p>
@@ -466,7 +455,7 @@
         <w:ind w:left="504"/>
       </w:pPr>
       <w:r>
-        <w:t>TerrainIQ PDF</w:t>
+        <w:t>OpenTopoData</w:t>
       </w:r>
     </w:p>
     <w:p>
@@ -475,7 +464,7 @@
         <w:ind w:left="504"/>
       </w:pPr>
       <w:r>
-        <w:t>SiteIQ PDF</w:t>
+        <w:t>AWS Terrarium tiles</w:t>
       </w:r>
     </w:p>
     <w:p>
@@ -484,7 +473,7 @@
         <w:ind w:left="504"/>
       </w:pPr>
       <w:r>
-        <w:t>YieldIQ PDF</w:t>
+        <w:t>Nominatim</w:t>
       </w:r>
     </w:p>
     <w:p>
@@ -495,7 +484,34 @@
         <w:rPr>
           <w:b/>
         </w:rPr>
-        <w:t>9. Glossary</w:t>
+        <w:t>7. Report Metrics &amp; PDF Fields</w:t>
+      </w:r>
+    </w:p>
+    <w:p>
+      <w:pPr>
+        <w:pStyle w:val="ListBullet"/>
+        <w:ind w:left="504"/>
+      </w:pPr>
+      <w:r>
+        <w:t>TerrainIQ PDF</w:t>
+      </w:r>
+    </w:p>
+    <w:p>
+      <w:pPr>
+        <w:pStyle w:val="ListBullet"/>
+        <w:ind w:left="504"/>
+      </w:pPr>
+      <w:r>
+        <w:t>SiteIQ PDF</w:t>
+      </w:r>
+    </w:p>
+    <w:p>
+      <w:pPr>
+        <w:pStyle w:val="ListBullet"/>
+        <w:ind w:left="504"/>
+      </w:pPr>
+      <w:r>
+        <w:t>YieldIQ PDF</w:t>
       </w:r>
     </w:p>
     <w:p>
@@ -506,6 +522,17 @@
         <w:rPr>
           <w:b/>
         </w:rPr>
+        <w:t>9. Glossary</w:t>
+      </w:r>
+    </w:p>
+    <w:p>
+      <w:pPr>
+        <w:pStyle w:val="ListNumber"/>
+      </w:pPr>
+      <w:r>
+        <w:rPr>
+          <w:b/>
+        </w:rPr>
         <w:t>10. Index</w:t>
       </w:r>
     </w:p>
@@ -8917,7 +8944,7 @@
         <w:t xml:space="preserve">Definition (plain English): </w:t>
       </w:r>
       <w:r>
-        <w:t>Automatic packing of fixed-tilt or single-axis tracker module rows inside the site boundary or SiteIQ buildable polygon.</w:t>
+        <w:t>Automatic packing of fixed-tilt or single-axis tracker module rows inside the site boundary or SiteIQ buildable polygon, with pitch/GCR sweep, map preview, A1 PDF, BOM CSV, and UTM-georeferenced layout DXF.</w:t>
       </w:r>
     </w:p>
     <w:p>
@@ -8928,7 +8955,7 @@
         <w:t xml:space="preserve">Formal engineering definition: </w:t>
       </w:r>
       <w:r>
-        <w:t>layoutiq/engine.run_layout() sweeps row bands on rotated boundary with setback inset; workflow layout_sweep compares mount/portrait/GCR matrix.</w:t>
+        <w:t>layoutiq/engine.run_layout() sweeps row bands on a boundary rotated by layout azimuth; POST /api/v1/workflow/layout-sweep compares mount/portrait/pitch steps; optimization_mode selects balanced/high_energy/land_optimized/custom GCR strategy.</w:t>
       </w:r>
     </w:p>
     <w:p>
@@ -8983,7 +9010,7 @@
         <w:t xml:space="preserve">Practical example: </w:t>
       </w:r>
       <w:r>
-        <w:t>146 ha buildable → 87 MWp SAT 1P GCR 0.33 selected row → feeds YieldIQ.</w:t>
+        <w:t>146 ha buildable → compare FT 2P vs SAT 1P sweep → select row → YieldIQ + project ZIP.</w:t>
       </w:r>
     </w:p>
     <w:p>
@@ -8994,7 +9021,7 @@
         <w:t xml:space="preserve">Accuracy considerations and limitations: </w:t>
       </w:r>
       <w:r>
-        <w:t>Conceptual layout — not electrical stringing or pile design.</w:t>
+        <w:t>Conceptual layout — not pile design or electrical stringing to combiner.</w:t>
       </w:r>
     </w:p>
     <w:p>
@@ -9005,7 +9032,7 @@
         <w:t xml:space="preserve">Common misconceptions: </w:t>
       </w:r>
       <w:r>
-        <w:t>LayoutIQ mount type is chosen here, not in Project Setup.</w:t>
+        <w:t>Mount type is chosen in LayoutIQ, not Project Setup. Sweep row pick ≠ optimization mode.</w:t>
       </w:r>
     </w:p>
     <w:p>
@@ -9027,7 +9054,7 @@
         <w:t xml:space="preserve">Related PVMath metrics: </w:t>
       </w:r>
       <w:r>
-        <w:t>GIS buildable area; GCR; MWp/ha; YieldIQ; DXF layout export.</w:t>
+        <w:t>GIS buildable area; GCR; Alignment guide; Layout DXF; YieldIQ.</w:t>
       </w:r>
     </w:p>
     <w:p/>
@@ -9036,7 +9063,7 @@
         <w:pStyle w:val="Heading2"/>
       </w:pPr>
       <w:r>
-        <w:t>2P portrait capacity density</w:t>
+        <w:t>LayoutIQ optimization mode (balanced / high energy / land optimized / custom GCR)</w:t>
       </w:r>
     </w:p>
     <w:p>
@@ -9047,7 +9074,7 @@
         <w:t xml:space="preserve">Definition (plain English): </w:t>
       </w:r>
       <w:r>
-        <w:t>Higher MW/ha screening values assuming double portrait module tables (two modules in portrait per rack).</w:t>
+        <w:t>Strategy that sets the recommended GCR/pitch band before the user picks a row from the sweep table — not a substitute for the sweep itself.</w:t>
       </w:r>
     </w:p>
     <w:p>
@@ -9058,7 +9085,7 @@
         <w:t xml:space="preserve">Formal engineering definition: </w:t>
       </w:r>
       <w:r>
-        <w:t>_BASE_DENSITY_2P approximately 1.85× 1P bases: Fixed Standard 0.74 MWp/ha @ GCR 0.30.</w:t>
+        <w:t>run_layout_sweep() uses optimization_mode to resolve land_cost class and default GCR curves; custom requires explicit custom_gcr in API body; sweep still steps pitch_m.</w:t>
       </w:r>
     </w:p>
     <w:p>
@@ -9069,7 +9096,7 @@
         <w:t xml:space="preserve">Why it matters in utility-scale solar: </w:t>
       </w:r>
       <w:r>
-        <w:t>Reflects denser DC packing for same footprint when 2P tables selected.</w:t>
+        <w:t>Separates industry-default spacing bias from the user's final pitch/GCR selection.</w:t>
       </w:r>
     </w:p>
     <w:p>
@@ -9091,7 +9118,7 @@
         <w:t xml:space="preserve">Units: </w:t>
       </w:r>
       <w:r>
-        <w:t>MWp/ha.</w:t>
+        <w:t>Mode enum + optional dimensionless GCR.</w:t>
       </w:r>
     </w:p>
     <w:p>
@@ -9102,7 +9129,7 @@
         <w:t xml:space="preserve">Typical industry ranges and interpretation: </w:t>
       </w:r>
       <w:r>
-        <w:t>2P Fixed Standard 0.74 vs 1P 0.40 @ GCR 0.30.</w:t>
+        <w:t>Custom GCR typically 0.30–0.45 utility ground-mount.</w:t>
       </w:r>
     </w:p>
     <w:p>
@@ -9113,7 +9140,7 @@
         <w:t xml:space="preserve">Practical example: </w:t>
       </w:r>
       <w:r>
-        <w:t>YieldIQ 2P Fixed band shows higher MWp than 1P Fixed at same GCR.</w:t>
+        <w:t>Custom GCR 0.38 → sweep pitches around that density; user still selects one table row.</w:t>
       </w:r>
     </w:p>
     <w:p>
@@ -9124,7 +9151,7 @@
         <w:t xml:space="preserve">Accuracy considerations and limitations: </w:t>
       </w:r>
       <w:r>
-        <w:t>Screening multiplier — actual 2P layout needs vendor-specific dimensions.</w:t>
+        <w:t>Recommended row is heuristic — not bankable energy optimisation.</w:t>
       </w:r>
     </w:p>
     <w:p>
@@ -9135,7 +9162,7 @@
         <w:t xml:space="preserve">Common misconceptions: </w:t>
       </w:r>
       <w:r>
-        <w:t>2P density does not auto-run in SiteIQ default — SiteIQ uses 1P band.</w:t>
+        <w:t>Changing mode without re-running sweep leaves stale results.</w:t>
       </w:r>
     </w:p>
     <w:p>
@@ -9146,7 +9173,7 @@
         <w:t xml:space="preserve">References to standards and sources: </w:t>
       </w:r>
       <w:r>
-        <w:t>pvmath_capacity._BASE_DENSITY_2P.</w:t>
+        <w:t>pvmath_workflow/layout_sweep.py; frontend LayoutIQ optimization_mode select.</w:t>
       </w:r>
     </w:p>
     <w:p>
@@ -9157,7 +9184,7 @@
         <w:t xml:space="preserve">Related PVMath metrics: </w:t>
       </w:r>
       <w:r>
-        <w:t>Yield configs; config_mwp_screen_2p.</w:t>
+        <w:t>GCR; Layout sweep table; Land cost class.</w:t>
       </w:r>
     </w:p>
     <w:p/>
@@ -9166,7 +9193,7 @@
         <w:pStyle w:val="Heading2"/>
       </w:pPr>
       <w:r>
-        <w:t>Capacity screening band (mwp_lo – mwp_hi)</w:t>
+        <w:t>LayoutIQ alignment guide (constant azimuth)</w:t>
       </w:r>
     </w:p>
     <w:p>
@@ -9177,7 +9204,7 @@
         <w:t xml:space="preserve">Definition (plain English): </w:t>
       </w:r>
       <w:r>
-        <w:t>Low and high indicative DC capacity from GCR 0.30–0.42 endpoints at 1P (or 2P) screening density.</w:t>
+        <w:t>Optional multi-point polyline drawn on the map; PVMath derives one layout azimuth for the entire PV area (length-weighted segment bearing) — no per-row rotation.</w:t>
       </w:r>
     </w:p>
     <w:p>
@@ -9188,7 +9215,7 @@
         <w:t xml:space="preserve">Formal engineering definition: </w:t>
       </w:r>
       <w:r>
-        <w:t>site_capacity_screen(): mwp_lo at gcr_lo, mwp_hi at gcr_hi with paired dens_lo/dens_hi.</w:t>
+        <w:t>layoutiq/alignment.py azimuth_from_alignment_polyline(); resolve_layout_azimuth() overrides manual azimuth when alignment_polyline has ≥2 WGS84 points.</w:t>
       </w:r>
     </w:p>
     <w:p>
@@ -9199,7 +9226,7 @@
         <w:t xml:space="preserve">Why it matters in utility-scale solar: </w:t>
       </w:r>
       <w:r>
-        <w:t>Communicates uncertainty before layout without false precision.</w:t>
+        <w:t>Skewed parcels align tracker axis or fixed-tilt rows to a boundary edge without manual angle trial.</w:t>
       </w:r>
     </w:p>
     <w:p>
@@ -9221,7 +9248,7 @@
         <w:t xml:space="preserve">Units: </w:t>
       </w:r>
       <w:r>
-        <w:t>MWp DC.</w:t>
+        <w:t>Degrees azimuth in [90, 270] (undirected axis).</w:t>
       </w:r>
     </w:p>
     <w:p>
@@ -9232,7 +9259,7 @@
         <w:t xml:space="preserve">Typical industry ranges and interpretation: </w:t>
       </w:r>
       <w:r>
-        <w:t>Band width ~40% span from GCR 0.30 to 0.42 alone.</w:t>
+        <w:t>Default SAT 180° (N–S axis); E–W edges ≈ 90°.</w:t>
       </w:r>
     </w:p>
     <w:p>
@@ -9243,7 +9270,7 @@
         <w:t xml:space="preserve">Practical example: </w:t>
       </w:r>
       <w:r>
-        <w:t>format_mwp_range: '~45–63 MWp DC'.</w:t>
+        <w:t>Trace north property line → guide azimuth 182° → entire layout rotates once.</w:t>
       </w:r>
     </w:p>
     <w:p>
@@ -9254,7 +9281,7 @@
         <w:t xml:space="preserve">Accuracy considerations and limitations: </w:t>
       </w:r>
       <w:r>
-        <w:t>Integer rounding to nearest MWp in config_mwp_screen.</w:t>
+        <w:t>Single constant azimuth — not local tangent or per-band rotation.</w:t>
       </w:r>
     </w:p>
     <w:p>
@@ -9265,7 +9292,7 @@
         <w:t xml:space="preserve">Common misconceptions: </w:t>
       </w:r>
       <w:r>
-        <w:t>Single MWp number is avoided — always a band in screening.</w:t>
+        <w:t>Preset azimuth dropdown is ignored when a valid guide polyline is sent.</w:t>
       </w:r>
     </w:p>
     <w:p>
@@ -9276,7 +9303,7 @@
         <w:t xml:space="preserve">References to standards and sources: </w:t>
       </w:r>
       <w:r>
-        <w:t>format_mwp_range(); TerrainIQ PDF capacity rows.</w:t>
+        <w:t>layoutiq/alignment.py; layoutiq/engine.py layout_rotation_angle().</w:t>
       </w:r>
     </w:p>
     <w:p>
@@ -9287,7 +9314,7 @@
         <w:t xml:space="preserve">Related PVMath metrics: </w:t>
       </w:r>
       <w:r>
-        <w:t>GCR screening band; MWh/yr band.</w:t>
+        <w:t>Tracker azimuth; SAT vs Fixed rotation; Layout DXF.</w:t>
       </w:r>
     </w:p>
     <w:p/>
@@ -9296,7 +9323,7 @@
         <w:pStyle w:val="Heading2"/>
       </w:pPr>
       <w:r>
-        <w:t>Agri-PV screening density</w:t>
+        <w:t>Single-axis tracker axis azimuth (LayoutIQ)</w:t>
       </w:r>
     </w:p>
     <w:p>
@@ -9307,7 +9334,7 @@
         <w:t xml:space="preserve">Definition (plain English): </w:t>
       </w:r>
       <w:r>
-        <w:t>Reduced MW/ha assumptions reflecting wider row spacing and agricultural access requirements.</w:t>
+        <w:t>Direction of the tracker torque tube / row axis; 180° = N–S rows tracking E–W.</w:t>
       </w:r>
     </w:p>
     <w:p>
@@ -9318,7 +9345,7 @@
         <w:t xml:space="preserve">Formal engineering definition: </w:t>
       </w:r>
       <w:r>
-        <w:t>Agri-PV _BASE_DENSITY entries ~50% of Standard for same mount/GCR.</w:t>
+        <w:t>layout_rotation_angle(azimuth, is_tracker=True) = azimuth − 90° CCW polygon rotation before row packing; SAT azimuth is no longer hard-coded N–S only.</w:t>
       </w:r>
     </w:p>
     <w:p>
@@ -9329,7 +9356,7 @@
         <w:t xml:space="preserve">Why it matters in utility-scale solar: </w:t>
       </w:r>
       <w:r>
-        <w:t>Prevents overstatement of MW potential on dual-use land.</w:t>
+        <w:t>Skewed sites need axis aligned to parcel — affects buildable MWp and row count.</w:t>
       </w:r>
     </w:p>
     <w:p>
@@ -9351,7 +9378,7 @@
         <w:t xml:space="preserve">Units: </w:t>
       </w:r>
       <w:r>
-        <w:t>MWp/ha.</w:t>
+        <w:t>Degrees geographic azimuth of axis.</w:t>
       </w:r>
     </w:p>
     <w:p>
@@ -9362,7 +9389,7 @@
         <w:t xml:space="preserve">Typical industry ranges and interpretation: </w:t>
       </w:r>
       <w:r>
-        <w:t>0.18–0.37 MWp/ha across mount/portrait in code tables.</w:t>
+        <w:t>180° default N–S; 90°/270° E–W axis sites.</w:t>
       </w:r>
     </w:p>
     <w:p>
@@ -9373,7 +9400,7 @@
         <w:t xml:space="preserve">Practical example: </w:t>
       </w:r>
       <w:r>
-        <w:t>Same 80 ha: Standard ~32 MWp lo vs Agri ~16 MWp lo fixed 1P.</w:t>
+        <w:t>135° axis on diagonal parcel vs 180° changes module count on same boundary.</w:t>
       </w:r>
     </w:p>
     <w:p>
@@ -9384,7 +9411,7 @@
         <w:t xml:space="preserve">Accuracy considerations and limitations: </w:t>
       </w:r>
       <w:r>
-        <w:t>Does not model crop-specific clearance rules.</w:t>
+        <w:t>Screening-grade rotation — not tracker manufacturer backtracking model.</w:t>
       </w:r>
     </w:p>
     <w:p>
@@ -9395,7 +9422,7 @@
         <w:t xml:space="preserve">Common misconceptions: </w:t>
       </w:r>
       <w:r>
-        <w:t>Agri-PV land use score 85 vs Standard 90 — slightly lower land category only.</w:t>
+        <w:t>Azimuth is not ignored for trackers (legacy Streamlit note was incorrect).</w:t>
       </w:r>
     </w:p>
     <w:p>
@@ -9406,7 +9433,7 @@
         <w:t xml:space="preserve">References to standards and sources: </w:t>
       </w:r>
       <w:r>
-        <w:t>pvmath_capacity Agri entries; DIN SPEC 91434 (context).</w:t>
+        <w:t>layoutiq/engine.py; layoutiq/alignment.py.</w:t>
       </w:r>
     </w:p>
     <w:p>
@@ -9417,7 +9444,7 @@
         <w:t xml:space="preserve">Related PVMath metrics: </w:t>
       </w:r>
       <w:r>
-        <w:t>Land use type; EEG Agri-PV.</w:t>
+        <w:t>Alignment guide; Fixed tilt azimuth; GCR.</w:t>
       </w:r>
     </w:p>
     <w:p/>
@@ -9426,7 +9453,7 @@
         <w:pStyle w:val="Heading2"/>
       </w:pPr>
       <w:r>
-        <w:t>Capacity screening disclaimer</w:t>
+        <w:t>Compare Fixed Tilt &amp; Tracker (layout sweep)</w:t>
       </w:r>
     </w:p>
     <w:p>
@@ -9437,7 +9464,7 @@
         <w:t xml:space="preserve">Definition (plain English): </w:t>
       </w:r>
       <w:r>
-        <w:t>Legal/engineering notice that MWp values are utility-scale screening bands, not layout-optimised DC.</w:t>
+        <w:t>LayoutIQ mount option that runs one sweep including both FT and SAT configurations (mount_filter=all).</w:t>
       </w:r>
     </w:p>
     <w:p>
@@ -9448,7 +9475,7 @@
         <w:t xml:space="preserve">Formal engineering definition: </w:t>
       </w:r>
       <w:r>
-        <w:t>CAPACITY_SCREENING_DISCLAIMER constant appended to PDFs and UI footnotes.</w:t>
+        <w:t>WorkflowLayoutSweepRequest mount_filter=all includes FT_1P–4P and SAT_1P/2P matrix per portrait filter.</w:t>
       </w:r>
     </w:p>
     <w:p>
@@ -9459,7 +9486,7 @@
         <w:t xml:space="preserve">Why it matters in utility-scale solar: </w:t>
       </w:r>
       <w:r>
-        <w:t>Sets client expectation before detailed layout and BOM.</w:t>
+        <w:t>Early feasibility often needs side-by-side FT vs SAT capacity on the same boundary.</w:t>
       </w:r>
     </w:p>
     <w:p>
@@ -9481,7 +9508,7 @@
         <w:t xml:space="preserve">Units: </w:t>
       </w:r>
       <w:r>
-        <w:t>Text.</w:t>
+        <w:t>Categorical mount filter.</w:t>
       </w:r>
     </w:p>
     <w:p>
@@ -9492,7 +9519,7 @@
         <w:t xml:space="preserve">Typical industry ranges and interpretation: </w:t>
       </w:r>
       <w:r>
-        <w:t>Always shown when capacity displayed.</w:t>
+        <w:t>Portrait 'Compare all' further multiplies configs — use single portrait on large sites.</w:t>
       </w:r>
     </w:p>
     <w:p>
@@ -9503,7 +9530,7 @@
         <w:t xml:space="preserve">Practical example: </w:t>
       </w:r>
       <w:r>
-        <w:t>'not layout-optimised DC' phrase mandatory.</w:t>
+        <w:t>99 ha site → table shows FT_2P and SAT_1P rows at multiple pitches in one run.</w:t>
       </w:r>
     </w:p>
     <w:p>
@@ -9514,7 +9541,7 @@
         <w:t xml:space="preserve">Accuracy considerations and limitations: </w:t>
       </w:r>
       <w:r>
-        <w:t>N/A.</w:t>
+        <w:t>Same GIS/buildable inputs for both — fair comparison at screening level.</w:t>
       </w:r>
     </w:p>
     <w:p>
@@ -9525,7 +9552,7 @@
         <w:t xml:space="preserve">Common misconceptions: </w:t>
       </w:r>
       <w:r>
-        <w:t>LayoutIQ (admin) produces different geometry-based counts — not merged into screening constants.</w:t>
+        <w:t>Does not auto-pick FT or SAT — user selects one sweep row for YieldIQ.</w:t>
       </w:r>
     </w:p>
     <w:p>
@@ -9536,7 +9563,7 @@
         <w:t xml:space="preserve">References to standards and sources: </w:t>
       </w:r>
       <w:r>
-        <w:t>pvmath_capacity.py header docstring.</w:t>
+        <w:t>pvmath_workflow/layout_sweep.py mount_filter.</w:t>
       </w:r>
     </w:p>
     <w:p>
@@ -9547,7 +9574,7 @@
         <w:t xml:space="preserve">Related PVMath metrics: </w:t>
       </w:r>
       <w:r>
-        <w:t>Capacity band; LayoutIQ (future).</w:t>
+        <w:t>LayoutIQ row packing; YieldIQ mount; MWp/ha.</w:t>
       </w:r>
     </w:p>
     <w:p/>
@@ -9556,7 +9583,7 @@
         <w:pStyle w:val="Heading2"/>
       </w:pPr>
       <w:r>
-        <w:t>1P vs 2P portrait orientation</w:t>
+        <w:t>2P portrait capacity density</w:t>
       </w:r>
     </w:p>
     <w:p>
@@ -9567,7 +9594,7 @@
         <w:t xml:space="preserve">Definition (plain English): </w:t>
       </w:r>
       <w:r>
-        <w:t>Single portrait (one module stack per table width) vs double portrait (two modules stacked vertically on rack).</w:t>
+        <w:t>Higher MW/ha screening values assuming double portrait module tables (two modules in portrait per rack).</w:t>
       </w:r>
     </w:p>
     <w:p>
@@ -9578,7 +9605,7 @@
         <w:t xml:space="preserve">Formal engineering definition: </w:t>
       </w:r>
       <w:r>
-        <w:t>Portrait flag in capacity_band(portrait='1P'|'2P') mapping to _BASE_DENSITY vs _BASE_DENSITY_2P.</w:t>
+        <w:t>_BASE_DENSITY_2P approximately 1.85× 1P bases: Fixed Standard 0.74 MWp/ha @ GCR 0.30.</w:t>
       </w:r>
     </w:p>
     <w:p>
@@ -9589,7 +9616,7 @@
         <w:t xml:space="preserve">Why it matters in utility-scale solar: </w:t>
       </w:r>
       <w:r>
-        <w:t>Affects DC density and wind loading — common EPC configuration choice.</w:t>
+        <w:t>Reflects denser DC packing for same footprint when 2P tables selected.</w:t>
       </w:r>
     </w:p>
     <w:p>
@@ -9611,7 +9638,7 @@
         <w:t xml:space="preserve">Units: </w:t>
       </w:r>
       <w:r>
-        <w:t>Categorical.</w:t>
+        <w:t>MWp/ha.</w:t>
       </w:r>
     </w:p>
     <w:p>
@@ -9622,7 +9649,7 @@
         <w:t xml:space="preserve">Typical industry ranges and interpretation: </w:t>
       </w:r>
       <w:r>
-        <w:t>2P ~74/65 MWp/ha vs 1P 40/35 for Standard Fixed/Tracker @ GCR 0.30.</w:t>
+        <w:t>2P Fixed Standard 0.74 vs 1P 0.40 @ GCR 0.30.</w:t>
       </w:r>
     </w:p>
     <w:p>
@@ -9633,7 +9660,7 @@
         <w:t xml:space="preserve">Practical example: </w:t>
       </w:r>
       <w:r>
-        <w:t>YieldIQ compares all four config labels in one run.</w:t>
+        <w:t>YieldIQ 2P Fixed band shows higher MWp than 1P Fixed at same GCR.</w:t>
       </w:r>
     </w:p>
     <w:p>
@@ -9644,7 +9671,7 @@
         <w:t xml:space="preserve">Accuracy considerations and limitations: </w:t>
       </w:r>
       <w:r>
-        <w:t>Does not model module dimensions explicitly in capacity module.</w:t>
+        <w:t>Screening multiplier — actual 2P layout needs vendor-specific dimensions.</w:t>
       </w:r>
     </w:p>
     <w:p>
@@ -9655,7 +9682,7 @@
         <w:t xml:space="preserve">Common misconceptions: </w:t>
       </w:r>
       <w:r>
-        <w:t>1P/2P is not monofacial vs bifacial.</w:t>
+        <w:t>2P density does not auto-run in SiteIQ default — SiteIQ uses 1P band.</w:t>
       </w:r>
     </w:p>
     <w:p>
@@ -9666,7 +9693,7 @@
         <w:t xml:space="preserve">References to standards and sources: </w:t>
       </w:r>
       <w:r>
-        <w:t>pvmath_capacity._CONFIG_TO_MOUNT_PORTRAIT.</w:t>
+        <w:t>pvmath_capacity._BASE_DENSITY_2P.</w:t>
       </w:r>
     </w:p>
     <w:p>
@@ -9677,7 +9704,7 @@
         <w:t xml:space="preserve">Related PVMath metrics: </w:t>
       </w:r>
       <w:r>
-        <w:t>2P density; Yield configs.</w:t>
+        <w:t>Yield configs; config_mwp_screen_2p.</w:t>
       </w:r>
     </w:p>
     <w:p/>
@@ -9686,7 +9713,7 @@
         <w:pStyle w:val="Heading2"/>
       </w:pPr>
       <w:r>
-        <w:t>Tracker GCR shading factor (0.40)</w:t>
+        <w:t>Capacity screening band (mwp_lo – mwp_hi)</w:t>
       </w:r>
     </w:p>
     <w:p>
@@ -9697,7 +9724,7 @@
         <w:t xml:space="preserve">Definition (plain English): </w:t>
       </w:r>
       <w:r>
-        <w:t>Row shading losses for trackers multiplied by 0.40 vs fixed tilt in gcr_shading() — backtracking proxy.</w:t>
+        <w:t>Low and high indicative DC capacity from GCR 0.30–0.42 endpoints at 1P (or 2P) screening density.</w:t>
       </w:r>
     </w:p>
     <w:p>
@@ -9708,7 +9735,7 @@
         <w:t xml:space="preserve">Formal engineering definition: </w:t>
       </w:r>
       <w:r>
-        <w:t>shade_tracker = shade_fixed × 0.40 at same GCR from interpolation table.</w:t>
+        <w:t>site_capacity_screen(): mwp_lo at gcr_lo, mwp_hi at gcr_hi with paired dens_lo/dens_hi.</w:t>
       </w:r>
     </w:p>
     <w:p>
@@ -9719,7 +9746,7 @@
         <w:t xml:space="preserve">Why it matters in utility-scale solar: </w:t>
       </w:r>
       <w:r>
-        <w:t>Explains higher optimal GCR on tracker projects in industry practice.</w:t>
+        <w:t>Communicates uncertainty before layout without false precision.</w:t>
       </w:r>
     </w:p>
     <w:p>
@@ -9741,7 +9768,7 @@
         <w:t xml:space="preserve">Units: </w:t>
       </w:r>
       <w:r>
-        <w:t>Dimensionless multiplier on shading percent.</w:t>
+        <w:t>MWp DC.</w:t>
       </w:r>
     </w:p>
     <w:p>
@@ -9752,7 +9779,7 @@
         <w:t xml:space="preserve">Typical industry ranges and interpretation: </w:t>
       </w:r>
       <w:r>
-        <w:t>At GCR 0.30: 1.0% fixed shading → 0.4% tracker equivalent in table.</w:t>
+        <w:t>Band width ~40% span from GCR 0.30 to 0.42 alone.</w:t>
       </w:r>
     </w:p>
     <w:p>
@@ -9763,7 +9790,7 @@
         <w:t xml:space="preserve">Practical example: </w:t>
       </w:r>
       <w:r>
-        <w:t>YieldIQ 1P Tracker often beats fixed on energy with similar GCR partly due to this factor plus inclined_axis yield.</w:t>
+        <w:t>format_mwp_range: '~45–63 MWp DC'.</w:t>
       </w:r>
     </w:p>
     <w:p>
@@ -9774,7 +9801,7 @@
         <w:t xml:space="preserve">Accuracy considerations and limitations: </w:t>
       </w:r>
       <w:r>
-        <w:t>Simplified — not hourly backtracking simulation.</w:t>
+        <w:t>Integer rounding to nearest MWp in config_mwp_screen.</w:t>
       </w:r>
     </w:p>
     <w:p>
@@ -9785,7 +9812,7 @@
         <w:t xml:space="preserve">Common misconceptions: </w:t>
       </w:r>
       <w:r>
-        <w:t>Not NREL SAM backtracking model.</w:t>
+        <w:t>Single MWp number is avoided — always a band in screening.</w:t>
       </w:r>
     </w:p>
     <w:p>
@@ -9796,7 +9823,7 @@
         <w:t xml:space="preserve">References to standards and sources: </w:t>
       </w:r>
       <w:r>
-        <w:t>pvmath_yield gcr_shading docstring.</w:t>
+        <w:t>format_mwp_range(); TerrainIQ PDF capacity rows.</w:t>
       </w:r>
     </w:p>
     <w:p>
@@ -9807,7 +9834,7 @@
         <w:t xml:space="preserve">Related PVMath metrics: </w:t>
       </w:r>
       <w:r>
-        <w:t>GCR shading; Analysis profile.</w:t>
+        <w:t>GCR screening band; MWh/yr band.</w:t>
       </w:r>
     </w:p>
     <w:p/>
@@ -9816,6 +9843,526 @@
         <w:pStyle w:val="Heading2"/>
       </w:pPr>
       <w:r>
+        <w:t>Agri-PV screening density</w:t>
+      </w:r>
+    </w:p>
+    <w:p>
+      <w:r>
+        <w:rPr>
+          <w:b/>
+        </w:rPr>
+        <w:t xml:space="preserve">Definition (plain English): </w:t>
+      </w:r>
+      <w:r>
+        <w:t>Reduced MW/ha assumptions reflecting wider row spacing and agricultural access requirements.</w:t>
+      </w:r>
+    </w:p>
+    <w:p>
+      <w:r>
+        <w:rPr>
+          <w:b/>
+        </w:rPr>
+        <w:t xml:space="preserve">Formal engineering definition: </w:t>
+      </w:r>
+      <w:r>
+        <w:t>Agri-PV _BASE_DENSITY entries ~50% of Standard for same mount/GCR.</w:t>
+      </w:r>
+    </w:p>
+    <w:p>
+      <w:r>
+        <w:rPr>
+          <w:b/>
+        </w:rPr>
+        <w:t xml:space="preserve">Why it matters in utility-scale solar: </w:t>
+      </w:r>
+      <w:r>
+        <w:t>Prevents overstatement of MW potential on dual-use land.</w:t>
+      </w:r>
+    </w:p>
+    <w:p>
+      <w:r>
+        <w:rPr>
+          <w:b/>
+        </w:rPr>
+        <w:t xml:space="preserve">How PVMath calculates or derives it: </w:t>
+      </w:r>
+      <w:r>
+        <w:t>Computed inside PVMath using industry-standard solar and terrain methods on region-routed public DEM (EEA-10, USGS 3DEP, FABDEM, GLO-30 fallback), PVGIS, and disclosed loss assumptions. Proprietary weighting, thresholds, and implementation constants are not published in this edition. Use in-app help and the Knowledge Centre at pvmath.com/guides for interpretation.</w:t>
+      </w:r>
+    </w:p>
+    <w:p>
+      <w:r>
+        <w:rPr>
+          <w:b/>
+        </w:rPr>
+        <w:t xml:space="preserve">Units: </w:t>
+      </w:r>
+      <w:r>
+        <w:t>MWp/ha.</w:t>
+      </w:r>
+    </w:p>
+    <w:p>
+      <w:r>
+        <w:rPr>
+          <w:b/>
+        </w:rPr>
+        <w:t xml:space="preserve">Typical industry ranges and interpretation: </w:t>
+      </w:r>
+      <w:r>
+        <w:t>0.18–0.37 MWp/ha across mount/portrait in code tables.</w:t>
+      </w:r>
+    </w:p>
+    <w:p>
+      <w:r>
+        <w:rPr>
+          <w:b/>
+        </w:rPr>
+        <w:t xml:space="preserve">Practical example: </w:t>
+      </w:r>
+      <w:r>
+        <w:t>Same 80 ha: Standard ~32 MWp lo vs Agri ~16 MWp lo fixed 1P.</w:t>
+      </w:r>
+    </w:p>
+    <w:p>
+      <w:r>
+        <w:rPr>
+          <w:b/>
+        </w:rPr>
+        <w:t xml:space="preserve">Accuracy considerations and limitations: </w:t>
+      </w:r>
+      <w:r>
+        <w:t>Does not model crop-specific clearance rules.</w:t>
+      </w:r>
+    </w:p>
+    <w:p>
+      <w:r>
+        <w:rPr>
+          <w:b/>
+        </w:rPr>
+        <w:t xml:space="preserve">Common misconceptions: </w:t>
+      </w:r>
+      <w:r>
+        <w:t>Agri-PV land use score 85 vs Standard 90 — slightly lower land category only.</w:t>
+      </w:r>
+    </w:p>
+    <w:p>
+      <w:r>
+        <w:rPr>
+          <w:b/>
+        </w:rPr>
+        <w:t xml:space="preserve">References to standards and sources: </w:t>
+      </w:r>
+      <w:r>
+        <w:t>pvmath_capacity Agri entries; DIN SPEC 91434 (context).</w:t>
+      </w:r>
+    </w:p>
+    <w:p>
+      <w:r>
+        <w:rPr>
+          <w:b/>
+        </w:rPr>
+        <w:t xml:space="preserve">Related PVMath metrics: </w:t>
+      </w:r>
+      <w:r>
+        <w:t>Land use type; EEG Agri-PV.</w:t>
+      </w:r>
+    </w:p>
+    <w:p/>
+    <w:p>
+      <w:pPr>
+        <w:pStyle w:val="Heading2"/>
+      </w:pPr>
+      <w:r>
+        <w:t>Capacity screening disclaimer</w:t>
+      </w:r>
+    </w:p>
+    <w:p>
+      <w:r>
+        <w:rPr>
+          <w:b/>
+        </w:rPr>
+        <w:t xml:space="preserve">Definition (plain English): </w:t>
+      </w:r>
+      <w:r>
+        <w:t>Legal/engineering notice that MWp values are utility-scale screening bands, not layout-optimised DC.</w:t>
+      </w:r>
+    </w:p>
+    <w:p>
+      <w:r>
+        <w:rPr>
+          <w:b/>
+        </w:rPr>
+        <w:t xml:space="preserve">Formal engineering definition: </w:t>
+      </w:r>
+      <w:r>
+        <w:t>CAPACITY_SCREENING_DISCLAIMER constant appended to PDFs and UI footnotes.</w:t>
+      </w:r>
+    </w:p>
+    <w:p>
+      <w:r>
+        <w:rPr>
+          <w:b/>
+        </w:rPr>
+        <w:t xml:space="preserve">Why it matters in utility-scale solar: </w:t>
+      </w:r>
+      <w:r>
+        <w:t>Sets client expectation before detailed layout and BOM.</w:t>
+      </w:r>
+    </w:p>
+    <w:p>
+      <w:r>
+        <w:rPr>
+          <w:b/>
+        </w:rPr>
+        <w:t xml:space="preserve">How PVMath calculates or derives it: </w:t>
+      </w:r>
+      <w:r>
+        <w:t>Computed inside PVMath using industry-standard solar and terrain methods on region-routed public DEM (EEA-10, USGS 3DEP, FABDEM, GLO-30 fallback), PVGIS, and disclosed loss assumptions. Proprietary weighting, thresholds, and implementation constants are not published in this edition. Use in-app help and the Knowledge Centre at pvmath.com/guides for interpretation.</w:t>
+      </w:r>
+    </w:p>
+    <w:p>
+      <w:r>
+        <w:rPr>
+          <w:b/>
+        </w:rPr>
+        <w:t xml:space="preserve">Units: </w:t>
+      </w:r>
+      <w:r>
+        <w:t>Text.</w:t>
+      </w:r>
+    </w:p>
+    <w:p>
+      <w:r>
+        <w:rPr>
+          <w:b/>
+        </w:rPr>
+        <w:t xml:space="preserve">Typical industry ranges and interpretation: </w:t>
+      </w:r>
+      <w:r>
+        <w:t>Always shown when capacity displayed.</w:t>
+      </w:r>
+    </w:p>
+    <w:p>
+      <w:r>
+        <w:rPr>
+          <w:b/>
+        </w:rPr>
+        <w:t xml:space="preserve">Practical example: </w:t>
+      </w:r>
+      <w:r>
+        <w:t>'not layout-optimised DC' phrase mandatory.</w:t>
+      </w:r>
+    </w:p>
+    <w:p>
+      <w:r>
+        <w:rPr>
+          <w:b/>
+        </w:rPr>
+        <w:t xml:space="preserve">Accuracy considerations and limitations: </w:t>
+      </w:r>
+      <w:r>
+        <w:t>N/A.</w:t>
+      </w:r>
+    </w:p>
+    <w:p>
+      <w:r>
+        <w:rPr>
+          <w:b/>
+        </w:rPr>
+        <w:t xml:space="preserve">Common misconceptions: </w:t>
+      </w:r>
+      <w:r>
+        <w:t>LayoutIQ (admin) produces different geometry-based counts — not merged into screening constants.</w:t>
+      </w:r>
+    </w:p>
+    <w:p>
+      <w:r>
+        <w:rPr>
+          <w:b/>
+        </w:rPr>
+        <w:t xml:space="preserve">References to standards and sources: </w:t>
+      </w:r>
+      <w:r>
+        <w:t>pvmath_capacity.py header docstring.</w:t>
+      </w:r>
+    </w:p>
+    <w:p>
+      <w:r>
+        <w:rPr>
+          <w:b/>
+        </w:rPr>
+        <w:t xml:space="preserve">Related PVMath metrics: </w:t>
+      </w:r>
+      <w:r>
+        <w:t>Capacity band; LayoutIQ (future).</w:t>
+      </w:r>
+    </w:p>
+    <w:p/>
+    <w:p>
+      <w:pPr>
+        <w:pStyle w:val="Heading2"/>
+      </w:pPr>
+      <w:r>
+        <w:t>1P vs 2P portrait orientation</w:t>
+      </w:r>
+    </w:p>
+    <w:p>
+      <w:r>
+        <w:rPr>
+          <w:b/>
+        </w:rPr>
+        <w:t xml:space="preserve">Definition (plain English): </w:t>
+      </w:r>
+      <w:r>
+        <w:t>Single portrait (one module stack per table width) vs double portrait (two modules stacked vertically on rack).</w:t>
+      </w:r>
+    </w:p>
+    <w:p>
+      <w:r>
+        <w:rPr>
+          <w:b/>
+        </w:rPr>
+        <w:t xml:space="preserve">Formal engineering definition: </w:t>
+      </w:r>
+      <w:r>
+        <w:t>Portrait flag in capacity_band(portrait='1P'|'2P') mapping to _BASE_DENSITY vs _BASE_DENSITY_2P.</w:t>
+      </w:r>
+    </w:p>
+    <w:p>
+      <w:r>
+        <w:rPr>
+          <w:b/>
+        </w:rPr>
+        <w:t xml:space="preserve">Why it matters in utility-scale solar: </w:t>
+      </w:r>
+      <w:r>
+        <w:t>Affects DC density and wind loading — common EPC configuration choice.</w:t>
+      </w:r>
+    </w:p>
+    <w:p>
+      <w:r>
+        <w:rPr>
+          <w:b/>
+        </w:rPr>
+        <w:t xml:space="preserve">How PVMath calculates or derives it: </w:t>
+      </w:r>
+      <w:r>
+        <w:t>Computed inside PVMath using industry-standard solar and terrain methods on region-routed public DEM (EEA-10, USGS 3DEP, FABDEM, GLO-30 fallback), PVGIS, and disclosed loss assumptions. Proprietary weighting, thresholds, and implementation constants are not published in this edition. Use in-app help and the Knowledge Centre at pvmath.com/guides for interpretation.</w:t>
+      </w:r>
+    </w:p>
+    <w:p>
+      <w:r>
+        <w:rPr>
+          <w:b/>
+        </w:rPr>
+        <w:t xml:space="preserve">Units: </w:t>
+      </w:r>
+      <w:r>
+        <w:t>Categorical.</w:t>
+      </w:r>
+    </w:p>
+    <w:p>
+      <w:r>
+        <w:rPr>
+          <w:b/>
+        </w:rPr>
+        <w:t xml:space="preserve">Typical industry ranges and interpretation: </w:t>
+      </w:r>
+      <w:r>
+        <w:t>2P ~74/65 MWp/ha vs 1P 40/35 for Standard Fixed/Tracker @ GCR 0.30.</w:t>
+      </w:r>
+    </w:p>
+    <w:p>
+      <w:r>
+        <w:rPr>
+          <w:b/>
+        </w:rPr>
+        <w:t xml:space="preserve">Practical example: </w:t>
+      </w:r>
+      <w:r>
+        <w:t>YieldIQ compares all four config labels in one run.</w:t>
+      </w:r>
+    </w:p>
+    <w:p>
+      <w:r>
+        <w:rPr>
+          <w:b/>
+        </w:rPr>
+        <w:t xml:space="preserve">Accuracy considerations and limitations: </w:t>
+      </w:r>
+      <w:r>
+        <w:t>Does not model module dimensions explicitly in capacity module.</w:t>
+      </w:r>
+    </w:p>
+    <w:p>
+      <w:r>
+        <w:rPr>
+          <w:b/>
+        </w:rPr>
+        <w:t xml:space="preserve">Common misconceptions: </w:t>
+      </w:r>
+      <w:r>
+        <w:t>1P/2P is not monofacial vs bifacial.</w:t>
+      </w:r>
+    </w:p>
+    <w:p>
+      <w:r>
+        <w:rPr>
+          <w:b/>
+        </w:rPr>
+        <w:t xml:space="preserve">References to standards and sources: </w:t>
+      </w:r>
+      <w:r>
+        <w:t>pvmath_capacity._CONFIG_TO_MOUNT_PORTRAIT.</w:t>
+      </w:r>
+    </w:p>
+    <w:p>
+      <w:r>
+        <w:rPr>
+          <w:b/>
+        </w:rPr>
+        <w:t xml:space="preserve">Related PVMath metrics: </w:t>
+      </w:r>
+      <w:r>
+        <w:t>2P density; Yield configs.</w:t>
+      </w:r>
+    </w:p>
+    <w:p/>
+    <w:p>
+      <w:pPr>
+        <w:pStyle w:val="Heading2"/>
+      </w:pPr>
+      <w:r>
+        <w:t>Tracker GCR shading factor (0.40)</w:t>
+      </w:r>
+    </w:p>
+    <w:p>
+      <w:r>
+        <w:rPr>
+          <w:b/>
+        </w:rPr>
+        <w:t xml:space="preserve">Definition (plain English): </w:t>
+      </w:r>
+      <w:r>
+        <w:t>Row shading losses for trackers multiplied by 0.40 vs fixed tilt in gcr_shading() — backtracking proxy.</w:t>
+      </w:r>
+    </w:p>
+    <w:p>
+      <w:r>
+        <w:rPr>
+          <w:b/>
+        </w:rPr>
+        <w:t xml:space="preserve">Formal engineering definition: </w:t>
+      </w:r>
+      <w:r>
+        <w:t>shade_tracker = shade_fixed × 0.40 at same GCR from interpolation table.</w:t>
+      </w:r>
+    </w:p>
+    <w:p>
+      <w:r>
+        <w:rPr>
+          <w:b/>
+        </w:rPr>
+        <w:t xml:space="preserve">Why it matters in utility-scale solar: </w:t>
+      </w:r>
+      <w:r>
+        <w:t>Explains higher optimal GCR on tracker projects in industry practice.</w:t>
+      </w:r>
+    </w:p>
+    <w:p>
+      <w:r>
+        <w:rPr>
+          <w:b/>
+        </w:rPr>
+        <w:t xml:space="preserve">How PVMath calculates or derives it: </w:t>
+      </w:r>
+      <w:r>
+        <w:t>Computed inside PVMath using industry-standard solar and terrain methods on region-routed public DEM (EEA-10, USGS 3DEP, FABDEM, GLO-30 fallback), PVGIS, and disclosed loss assumptions. Proprietary weighting, thresholds, and implementation constants are not published in this edition. Use in-app help and the Knowledge Centre at pvmath.com/guides for interpretation.</w:t>
+      </w:r>
+    </w:p>
+    <w:p>
+      <w:r>
+        <w:rPr>
+          <w:b/>
+        </w:rPr>
+        <w:t xml:space="preserve">Units: </w:t>
+      </w:r>
+      <w:r>
+        <w:t>Dimensionless multiplier on shading percent.</w:t>
+      </w:r>
+    </w:p>
+    <w:p>
+      <w:r>
+        <w:rPr>
+          <w:b/>
+        </w:rPr>
+        <w:t xml:space="preserve">Typical industry ranges and interpretation: </w:t>
+      </w:r>
+      <w:r>
+        <w:t>At GCR 0.30: 1.0% fixed shading → 0.4% tracker equivalent in table.</w:t>
+      </w:r>
+    </w:p>
+    <w:p>
+      <w:r>
+        <w:rPr>
+          <w:b/>
+        </w:rPr>
+        <w:t xml:space="preserve">Practical example: </w:t>
+      </w:r>
+      <w:r>
+        <w:t>YieldIQ 1P Tracker often beats fixed on energy with similar GCR partly due to this factor plus inclined_axis yield.</w:t>
+      </w:r>
+    </w:p>
+    <w:p>
+      <w:r>
+        <w:rPr>
+          <w:b/>
+        </w:rPr>
+        <w:t xml:space="preserve">Accuracy considerations and limitations: </w:t>
+      </w:r>
+      <w:r>
+        <w:t>Simplified — not hourly backtracking simulation.</w:t>
+      </w:r>
+    </w:p>
+    <w:p>
+      <w:r>
+        <w:rPr>
+          <w:b/>
+        </w:rPr>
+        <w:t xml:space="preserve">Common misconceptions: </w:t>
+      </w:r>
+      <w:r>
+        <w:t>Not NREL SAM backtracking model.</w:t>
+      </w:r>
+    </w:p>
+    <w:p>
+      <w:r>
+        <w:rPr>
+          <w:b/>
+        </w:rPr>
+        <w:t xml:space="preserve">References to standards and sources: </w:t>
+      </w:r>
+      <w:r>
+        <w:t>pvmath_yield gcr_shading docstring.</w:t>
+      </w:r>
+    </w:p>
+    <w:p>
+      <w:r>
+        <w:rPr>
+          <w:b/>
+        </w:rPr>
+        <w:t xml:space="preserve">Related PVMath metrics: </w:t>
+      </w:r>
+      <w:r>
+        <w:t>GCR shading; Analysis profile.</w:t>
+      </w:r>
+    </w:p>
+    <w:p/>
+    <w:p>
+      <w:pPr>
+        <w:pStyle w:val="Heading2"/>
+      </w:pPr>
+      <w:r>
         <w:t>Boundary setback (LayoutIQ — admin)</w:t>
       </w:r>
     </w:p>
@@ -10736,6 +11283,136 @@
       </w:r>
       <w:r>
         <w:t>Georef package; reference.json.</w:t>
+      </w:r>
+    </w:p>
+    <w:p/>
+    <w:p>
+      <w:pPr>
+        <w:pStyle w:val="Heading2"/>
+      </w:pPr>
+      <w:r>
+        <w:t>LayoutIQ layout DXF (PVM_ layers, UTM georef)</w:t>
+      </w:r>
+    </w:p>
+    <w:p>
+      <w:r>
+        <w:rPr>
+          <w:b/>
+        </w:rPr>
+        <w:t xml:space="preserve">Definition (plain English): </w:t>
+      </w:r>
+      <w:r>
+        <w:t>Auto-layout geometry as binary DXF in WGS84 UTM with PVMath layers: PVM_SiteBoundary, PVM_Buildable, PVM_Strings, PVM_Tr_8S…1S, PVM_F_1P…4P.</w:t>
+      </w:r>
+    </w:p>
+    <w:p>
+      <w:r>
+        <w:rPr>
+          <w:b/>
+        </w:rPr>
+        <w:t xml:space="preserve">Formal engineering definition: </w:t>
+      </w:r>
+      <w:r>
+        <w:t>export_layout_dxf(): vertex coords via xy_to_latlon → latlon_to_utm; strings and tracker unit boxes exported overlaid.</w:t>
+      </w:r>
+    </w:p>
+    <w:p>
+      <w:r>
+        <w:rPr>
+          <w:b/>
+        </w:rPr>
+        <w:t xml:space="preserve">Why it matters in utility-scale solar: </w:t>
+      </w:r>
+      <w:r>
+        <w:t>CAD overlay with terrain and civil workflows at map coordinates.</w:t>
+      </w:r>
+    </w:p>
+    <w:p>
+      <w:r>
+        <w:rPr>
+          <w:b/>
+        </w:rPr>
+        <w:t xml:space="preserve">How PVMath calculates or derives it: </w:t>
+      </w:r>
+      <w:r>
+        <w:t>Computed inside PVMath using industry-standard solar and terrain methods on region-routed public DEM (EEA-10, USGS 3DEP, FABDEM, GLO-30 fallback), PVGIS, and disclosed loss assumptions. Proprietary weighting, thresholds, and implementation constants are not published in this edition. Use in-app help and the Knowledge Centre at pvmath.com/guides for interpretation.</w:t>
+      </w:r>
+    </w:p>
+    <w:p>
+      <w:r>
+        <w:rPr>
+          <w:b/>
+        </w:rPr>
+        <w:t xml:space="preserve">Units: </w:t>
+      </w:r>
+      <w:r>
+        <w:t>UTM metres (EPSG from site centroid).</w:t>
+      </w:r>
+    </w:p>
+    <w:p>
+      <w:r>
+        <w:rPr>
+          <w:b/>
+        </w:rPr>
+        <w:t xml:space="preserve">Typical industry ranges and interpretation: </w:t>
+      </w:r>
+      <w:r>
+        <w:t>One DXF per selected sweep row.</w:t>
+      </w:r>
+    </w:p>
+    <w:p>
+      <w:r>
+        <w:rPr>
+          <w:b/>
+        </w:rPr>
+        <w:t xml:space="preserve">Practical example: </w:t>
+      </w:r>
+      <w:r>
+        <w:t>PVM_Tr_7S boxes with PVM_Strings module rectangles on same UTM coords.</w:t>
+      </w:r>
+    </w:p>
+    <w:p>
+      <w:r>
+        <w:rPr>
+          <w:b/>
+        </w:rPr>
+        <w:t xml:space="preserve">Accuracy considerations and limitations: </w:t>
+      </w:r>
+      <w:r>
+        <w:t>Screening layout — not as-built survey.</w:t>
+      </w:r>
+    </w:p>
+    <w:p>
+      <w:r>
+        <w:rPr>
+          <w:b/>
+        </w:rPr>
+        <w:t xml:space="preserve">Common misconceptions: </w:t>
+      </w:r>
+      <w:r>
+        <w:t>Separate from TerrainIQ contour DXF in Terrain Data folder.</w:t>
+      </w:r>
+    </w:p>
+    <w:p>
+      <w:r>
+        <w:rPr>
+          <w:b/>
+        </w:rPr>
+        <w:t xml:space="preserve">References to standards and sources: </w:t>
+      </w:r>
+      <w:r>
+        <w:t>pvmath_workflow/layout_detail.py; layoutiq/dxf_layers.py.</w:t>
+      </w:r>
+    </w:p>
+    <w:p>
+      <w:r>
+        <w:rPr>
+          <w:b/>
+        </w:rPr>
+        <w:t xml:space="preserve">Related PVMath metrics: </w:t>
+      </w:r>
+      <w:r>
+        <w:t>Alignment guide; A1 layout PDF; BOM CSV.</w:t>
       </w:r>
     </w:p>
     <w:p/>
@@ -13773,12 +14450,22 @@
           </w:tcPr>
           <w:p>
             <w:r>
-              <w:t>Contour interval</w:t>
+              <w:t>Compare Fixed Tilt &amp; Tracker</w:t>
             </w:r>
           </w:p>
         </w:tc>
       </w:tr>
       <w:tr>
+        <w:tc>
+          <w:tcPr>
+            <w:tcW w:type="dxa" w:w="2880"/>
+          </w:tcPr>
+          <w:p>
+            <w:r>
+              <w:t>Contour interval</w:t>
+            </w:r>
+          </w:p>
+        </w:tc>
         <w:tc>
           <w:tcPr>
             <w:tcW w:type="dxa" w:w="2880"/>
@@ -13799,6 +14486,8 @@
             </w:r>
           </w:p>
         </w:tc>
+      </w:tr>
+      <w:tr>
         <w:tc>
           <w:tcPr>
             <w:tcW w:type="dxa" w:w="2880"/>
@@ -13809,8 +14498,6 @@
             </w:r>
           </w:p>
         </w:tc>
-      </w:tr>
-      <w:tr>
         <w:tc>
           <w:tcPr>
             <w:tcW w:type="dxa" w:w="2880"/>
@@ -13831,6 +14518,8 @@
             </w:r>
           </w:p>
         </w:tc>
+      </w:tr>
+      <w:tr>
         <w:tc>
           <w:tcPr>
             <w:tcW w:type="dxa" w:w="2880"/>
@@ -13841,8 +14530,6 @@
             </w:r>
           </w:p>
         </w:tc>
-      </w:tr>
-      <w:tr>
         <w:tc>
           <w:tcPr>
             <w:tcW w:type="dxa" w:w="2880"/>
@@ -13863,6 +14550,8 @@
             </w:r>
           </w:p>
         </w:tc>
+      </w:tr>
+      <w:tr>
         <w:tc>
           <w:tcPr>
             <w:tcW w:type="dxa" w:w="2880"/>
@@ -13873,8 +14562,6 @@
             </w:r>
           </w:p>
         </w:tc>
-      </w:tr>
-      <w:tr>
         <w:tc>
           <w:tcPr>
             <w:tcW w:type="dxa" w:w="2880"/>
@@ -13895,6 +14582,8 @@
             </w:r>
           </w:p>
         </w:tc>
+      </w:tr>
+      <w:tr>
         <w:tc>
           <w:tcPr>
             <w:tcW w:type="dxa" w:w="2880"/>
@@ -13905,8 +14594,6 @@
             </w:r>
           </w:p>
         </w:tc>
-      </w:tr>
-      <w:tr>
         <w:tc>
           <w:tcPr>
             <w:tcW w:type="dxa" w:w="2880"/>
@@ -13927,6 +14614,8 @@
             </w:r>
           </w:p>
         </w:tc>
+      </w:tr>
+      <w:tr>
         <w:tc>
           <w:tcPr>
             <w:tcW w:type="dxa" w:w="2880"/>
@@ -13937,8 +14626,6 @@
             </w:r>
           </w:p>
         </w:tc>
-      </w:tr>
-      <w:tr>
         <w:tc>
           <w:tcPr>
             <w:tcW w:type="dxa" w:w="2880"/>
@@ -13959,6 +14646,8 @@
             </w:r>
           </w:p>
         </w:tc>
+      </w:tr>
+      <w:tr>
         <w:tc>
           <w:tcPr>
             <w:tcW w:type="dxa" w:w="2880"/>
@@ -13969,8 +14658,6 @@
             </w:r>
           </w:p>
         </w:tc>
-      </w:tr>
-      <w:tr>
         <w:tc>
           <w:tcPr>
             <w:tcW w:type="dxa" w:w="2880"/>
@@ -13991,6 +14678,8 @@
             </w:r>
           </w:p>
         </w:tc>
+      </w:tr>
+      <w:tr>
         <w:tc>
           <w:tcPr>
             <w:tcW w:type="dxa" w:w="2880"/>
@@ -14001,8 +14690,6 @@
             </w:r>
           </w:p>
         </w:tc>
-      </w:tr>
-      <w:tr>
         <w:tc>
           <w:tcPr>
             <w:tcW w:type="dxa" w:w="2880"/>
@@ -14023,6 +14710,8 @@
             </w:r>
           </w:p>
         </w:tc>
+      </w:tr>
+      <w:tr>
         <w:tc>
           <w:tcPr>
             <w:tcW w:type="dxa" w:w="2880"/>
@@ -14033,8 +14722,6 @@
             </w:r>
           </w:p>
         </w:tc>
-      </w:tr>
-      <w:tr>
         <w:tc>
           <w:tcPr>
             <w:tcW w:type="dxa" w:w="2880"/>
@@ -14055,6 +14742,8 @@
             </w:r>
           </w:p>
         </w:tc>
+      </w:tr>
+      <w:tr>
         <w:tc>
           <w:tcPr>
             <w:tcW w:type="dxa" w:w="2880"/>
@@ -14065,8 +14754,6 @@
             </w:r>
           </w:p>
         </w:tc>
-      </w:tr>
-      <w:tr>
         <w:tc>
           <w:tcPr>
             <w:tcW w:type="dxa" w:w="2880"/>
@@ -14087,6 +14774,8 @@
             </w:r>
           </w:p>
         </w:tc>
+      </w:tr>
+      <w:tr>
         <w:tc>
           <w:tcPr>
             <w:tcW w:type="dxa" w:w="2880"/>
@@ -14097,8 +14786,6 @@
             </w:r>
           </w:p>
         </w:tc>
-      </w:tr>
-      <w:tr>
         <w:tc>
           <w:tcPr>
             <w:tcW w:type="dxa" w:w="2880"/>
@@ -14119,6 +14806,8 @@
             </w:r>
           </w:p>
         </w:tc>
+      </w:tr>
+      <w:tr>
         <w:tc>
           <w:tcPr>
             <w:tcW w:type="dxa" w:w="2880"/>
@@ -14129,8 +14818,6 @@
             </w:r>
           </w:p>
         </w:tc>
-      </w:tr>
-      <w:tr>
         <w:tc>
           <w:tcPr>
             <w:tcW w:type="dxa" w:w="2880"/>
@@ -14151,6 +14838,8 @@
             </w:r>
           </w:p>
         </w:tc>
+      </w:tr>
+      <w:tr>
         <w:tc>
           <w:tcPr>
             <w:tcW w:type="dxa" w:w="2880"/>
@@ -14161,8 +14850,6 @@
             </w:r>
           </w:p>
         </w:tc>
-      </w:tr>
-      <w:tr>
         <w:tc>
           <w:tcPr>
             <w:tcW w:type="dxa" w:w="2880"/>
@@ -14183,6 +14870,8 @@
             </w:r>
           </w:p>
         </w:tc>
+      </w:tr>
+      <w:tr>
         <w:tc>
           <w:tcPr>
             <w:tcW w:type="dxa" w:w="2880"/>
@@ -14193,8 +14882,6 @@
             </w:r>
           </w:p>
         </w:tc>
-      </w:tr>
-      <w:tr>
         <w:tc>
           <w:tcPr>
             <w:tcW w:type="dxa" w:w="2880"/>
@@ -14215,6 +14902,18 @@
             </w:r>
           </w:p>
         </w:tc>
+      </w:tr>
+      <w:tr>
+        <w:tc>
+          <w:tcPr>
+            <w:tcW w:type="dxa" w:w="2880"/>
+          </w:tcPr>
+          <w:p>
+            <w:r>
+              <w:t>LayoutIQ alignment guide</w:t>
+            </w:r>
+          </w:p>
+        </w:tc>
         <w:tc>
           <w:tcPr>
             <w:tcW w:type="dxa" w:w="2880"/>
@@ -14225,8 +14924,28 @@
             </w:r>
           </w:p>
         </w:tc>
+        <w:tc>
+          <w:tcPr>
+            <w:tcW w:type="dxa" w:w="2880"/>
+          </w:tcPr>
+          <w:p>
+            <w:r>
+              <w:t>LayoutIQ layout DXF</w:t>
+            </w:r>
+          </w:p>
+        </w:tc>
       </w:tr>
       <w:tr>
+        <w:tc>
+          <w:tcPr>
+            <w:tcW w:type="dxa" w:w="2880"/>
+          </w:tcPr>
+          <w:p>
+            <w:r>
+              <w:t>LayoutIQ optimization mode</w:t>
+            </w:r>
+          </w:p>
+        </w:tc>
         <w:tc>
           <w:tcPr>
             <w:tcW w:type="dxa" w:w="2880"/>
@@ -14247,6 +14966,8 @@
             </w:r>
           </w:p>
         </w:tc>
+      </w:tr>
+      <w:tr>
         <w:tc>
           <w:tcPr>
             <w:tcW w:type="dxa" w:w="2880"/>
@@ -14257,8 +14978,6 @@
             </w:r>
           </w:p>
         </w:tc>
-      </w:tr>
-      <w:tr>
         <w:tc>
           <w:tcPr>
             <w:tcW w:type="dxa" w:w="2880"/>
@@ -14279,6 +14998,8 @@
             </w:r>
           </w:p>
         </w:tc>
+      </w:tr>
+      <w:tr>
         <w:tc>
           <w:tcPr>
             <w:tcW w:type="dxa" w:w="2880"/>
@@ -14289,8 +15010,6 @@
             </w:r>
           </w:p>
         </w:tc>
-      </w:tr>
-      <w:tr>
         <w:tc>
           <w:tcPr>
             <w:tcW w:type="dxa" w:w="2880"/>
@@ -14311,6 +15030,8 @@
             </w:r>
           </w:p>
         </w:tc>
+      </w:tr>
+      <w:tr>
         <w:tc>
           <w:tcPr>
             <w:tcW w:type="dxa" w:w="2880"/>
@@ -14321,8 +15042,6 @@
             </w:r>
           </w:p>
         </w:tc>
-      </w:tr>
-      <w:tr>
         <w:tc>
           <w:tcPr>
             <w:tcW w:type="dxa" w:w="2880"/>
@@ -14343,6 +15062,8 @@
             </w:r>
           </w:p>
         </w:tc>
+      </w:tr>
+      <w:tr>
         <w:tc>
           <w:tcPr>
             <w:tcW w:type="dxa" w:w="2880"/>
@@ -14353,8 +15074,6 @@
             </w:r>
           </w:p>
         </w:tc>
-      </w:tr>
-      <w:tr>
         <w:tc>
           <w:tcPr>
             <w:tcW w:type="dxa" w:w="2880"/>
@@ -14375,6 +15094,8 @@
             </w:r>
           </w:p>
         </w:tc>
+      </w:tr>
+      <w:tr>
         <w:tc>
           <w:tcPr>
             <w:tcW w:type="dxa" w:w="2880"/>
@@ -14385,8 +15106,6 @@
             </w:r>
           </w:p>
         </w:tc>
-      </w:tr>
-      <w:tr>
         <w:tc>
           <w:tcPr>
             <w:tcW w:type="dxa" w:w="2880"/>
@@ -14407,6 +15126,8 @@
             </w:r>
           </w:p>
         </w:tc>
+      </w:tr>
+      <w:tr>
         <w:tc>
           <w:tcPr>
             <w:tcW w:type="dxa" w:w="2880"/>
@@ -14417,8 +15138,6 @@
             </w:r>
           </w:p>
         </w:tc>
-      </w:tr>
-      <w:tr>
         <w:tc>
           <w:tcPr>
             <w:tcW w:type="dxa" w:w="2880"/>
@@ -14439,6 +15158,8 @@
             </w:r>
           </w:p>
         </w:tc>
+      </w:tr>
+      <w:tr>
         <w:tc>
           <w:tcPr>
             <w:tcW w:type="dxa" w:w="2880"/>
@@ -14449,8 +15170,6 @@
             </w:r>
           </w:p>
         </w:tc>
-      </w:tr>
-      <w:tr>
         <w:tc>
           <w:tcPr>
             <w:tcW w:type="dxa" w:w="2880"/>
@@ -14471,6 +15190,8 @@
             </w:r>
           </w:p>
         </w:tc>
+      </w:tr>
+      <w:tr>
         <w:tc>
           <w:tcPr>
             <w:tcW w:type="dxa" w:w="2880"/>
@@ -14481,8 +15202,6 @@
             </w:r>
           </w:p>
         </w:tc>
-      </w:tr>
-      <w:tr>
         <w:tc>
           <w:tcPr>
             <w:tcW w:type="dxa" w:w="2880"/>
@@ -14503,6 +15222,8 @@
             </w:r>
           </w:p>
         </w:tc>
+      </w:tr>
+      <w:tr>
         <w:tc>
           <w:tcPr>
             <w:tcW w:type="dxa" w:w="2880"/>
@@ -14513,8 +15234,6 @@
             </w:r>
           </w:p>
         </w:tc>
-      </w:tr>
-      <w:tr>
         <w:tc>
           <w:tcPr>
             <w:tcW w:type="dxa" w:w="2880"/>
@@ -14535,6 +15254,8 @@
             </w:r>
           </w:p>
         </w:tc>
+      </w:tr>
+      <w:tr>
         <w:tc>
           <w:tcPr>
             <w:tcW w:type="dxa" w:w="2880"/>
@@ -14545,8 +15266,6 @@
             </w:r>
           </w:p>
         </w:tc>
-      </w:tr>
-      <w:tr>
         <w:tc>
           <w:tcPr>
             <w:tcW w:type="dxa" w:w="2880"/>
@@ -14567,6 +15286,8 @@
             </w:r>
           </w:p>
         </w:tc>
+      </w:tr>
+      <w:tr>
         <w:tc>
           <w:tcPr>
             <w:tcW w:type="dxa" w:w="2880"/>
@@ -14577,8 +15298,6 @@
             </w:r>
           </w:p>
         </w:tc>
-      </w:tr>
-      <w:tr>
         <w:tc>
           <w:tcPr>
             <w:tcW w:type="dxa" w:w="2880"/>
@@ -14599,6 +15318,8 @@
             </w:r>
           </w:p>
         </w:tc>
+      </w:tr>
+      <w:tr>
         <w:tc>
           <w:tcPr>
             <w:tcW w:type="dxa" w:w="2880"/>
@@ -14609,8 +15330,6 @@
             </w:r>
           </w:p>
         </w:tc>
-      </w:tr>
-      <w:tr>
         <w:tc>
           <w:tcPr>
             <w:tcW w:type="dxa" w:w="2880"/>
@@ -14621,6 +15340,18 @@
             </w:r>
           </w:p>
         </w:tc>
+        <w:tc>
+          <w:tcPr>
+            <w:tcW w:type="dxa" w:w="2880"/>
+          </w:tcPr>
+          <w:p>
+            <w:r>
+              <w:t>Single-axis tracker axis azimuth</w:t>
+            </w:r>
+          </w:p>
+        </w:tc>
+      </w:tr>
+      <w:tr>
         <w:tc>
           <w:tcPr>
             <w:tcW w:type="dxa" w:w="2880"/>
@@ -14641,8 +15372,6 @@
             </w:r>
           </w:p>
         </w:tc>
-      </w:tr>
-      <w:tr>
         <w:tc>
           <w:tcPr>
             <w:tcW w:type="dxa" w:w="2880"/>
@@ -14653,6 +15382,8 @@
             </w:r>
           </w:p>
         </w:tc>
+      </w:tr>
+      <w:tr>
         <w:tc>
           <w:tcPr>
             <w:tcW w:type="dxa" w:w="2880"/>
@@ -14673,8 +15404,6 @@
             </w:r>
           </w:p>
         </w:tc>
-      </w:tr>
-      <w:tr>
         <w:tc>
           <w:tcPr>
             <w:tcW w:type="dxa" w:w="2880"/>
@@ -14685,6 +15414,8 @@
             </w:r>
           </w:p>
         </w:tc>
+      </w:tr>
+      <w:tr>
         <w:tc>
           <w:tcPr>
             <w:tcW w:type="dxa" w:w="2880"/>
@@ -14705,8 +15436,6 @@
             </w:r>
           </w:p>
         </w:tc>
-      </w:tr>
-      <w:tr>
         <w:tc>
           <w:tcPr>
             <w:tcW w:type="dxa" w:w="2880"/>
@@ -14717,6 +15446,8 @@
             </w:r>
           </w:p>
         </w:tc>
+      </w:tr>
+      <w:tr>
         <w:tc>
           <w:tcPr>
             <w:tcW w:type="dxa" w:w="2880"/>
@@ -14737,8 +15468,6 @@
             </w:r>
           </w:p>
         </w:tc>
-      </w:tr>
-      <w:tr>
         <w:tc>
           <w:tcPr>
             <w:tcW w:type="dxa" w:w="2880"/>
@@ -14749,6 +15478,8 @@
             </w:r>
           </w:p>
         </w:tc>
+      </w:tr>
+      <w:tr>
         <w:tc>
           <w:tcPr>
             <w:tcW w:type="dxa" w:w="2880"/>
@@ -14769,8 +15500,6 @@
             </w:r>
           </w:p>
         </w:tc>
-      </w:tr>
-      <w:tr>
         <w:tc>
           <w:tcPr>
             <w:tcW w:type="dxa" w:w="2880"/>
@@ -14781,6 +15510,8 @@
             </w:r>
           </w:p>
         </w:tc>
+      </w:tr>
+      <w:tr>
         <w:tc>
           <w:tcPr>
             <w:tcW w:type="dxa" w:w="2880"/>
@@ -14801,8 +15532,6 @@
             </w:r>
           </w:p>
         </w:tc>
-      </w:tr>
-      <w:tr>
         <w:tc>
           <w:tcPr>
             <w:tcW w:type="dxa" w:w="2880"/>
@@ -14813,6 +15542,8 @@
             </w:r>
           </w:p>
         </w:tc>
+      </w:tr>
+      <w:tr>
         <w:tc>
           <w:tcPr>
             <w:tcW w:type="dxa" w:w="2880"/>
@@ -14833,8 +15564,6 @@
             </w:r>
           </w:p>
         </w:tc>
-      </w:tr>
-      <w:tr>
         <w:tc>
           <w:tcPr>
             <w:tcW w:type="dxa" w:w="2880"/>
@@ -14845,6 +15574,8 @@
             </w:r>
           </w:p>
         </w:tc>
+      </w:tr>
+      <w:tr>
         <w:tc>
           <w:tcPr>
             <w:tcW w:type="dxa" w:w="2880"/>
@@ -14865,8 +15596,6 @@
             </w:r>
           </w:p>
         </w:tc>
-      </w:tr>
-      <w:tr>
         <w:tc>
           <w:tcPr>
             <w:tcW w:type="dxa" w:w="2880"/>
@@ -14877,6 +15606,8 @@
             </w:r>
           </w:p>
         </w:tc>
+      </w:tr>
+      <w:tr>
         <w:tc>
           <w:tcPr>
             <w:tcW w:type="dxa" w:w="2880"/>
@@ -14897,8 +15628,6 @@
             </w:r>
           </w:p>
         </w:tc>
-      </w:tr>
-      <w:tr>
         <w:tc>
           <w:tcPr>
             <w:tcW w:type="dxa" w:w="2880"/>
@@ -14909,6 +15638,8 @@
             </w:r>
           </w:p>
         </w:tc>
+      </w:tr>
+      <w:tr>
         <w:tc>
           <w:tcPr>
             <w:tcW w:type="dxa" w:w="2880"/>
@@ -14929,8 +15660,6 @@
             </w:r>
           </w:p>
         </w:tc>
-      </w:tr>
-      <w:tr>
         <w:tc>
           <w:tcPr>
             <w:tcW w:type="dxa" w:w="2880"/>
@@ -14941,6 +15670,8 @@
             </w:r>
           </w:p>
         </w:tc>
+      </w:tr>
+      <w:tr>
         <w:tc>
           <w:tcPr>
             <w:tcW w:type="dxa" w:w="2880"/>
@@ -14961,8 +15692,6 @@
             </w:r>
           </w:p>
         </w:tc>
-      </w:tr>
-      <w:tr>
         <w:tc>
           <w:tcPr>
             <w:tcW w:type="dxa" w:w="2880"/>
@@ -14972,18 +15701,6 @@
               <w:t>YieldIQ PDF — configuration comparison table</w:t>
             </w:r>
           </w:p>
-        </w:tc>
-        <w:tc>
-          <w:tcPr>
-            <w:tcW w:type="dxa" w:w="2880"/>
-          </w:tcPr>
-          <w:p/>
-        </w:tc>
-        <w:tc>
-          <w:tcPr>
-            <w:tcW w:type="dxa" w:w="2880"/>
-          </w:tcPr>
-          <w:p/>
         </w:tc>
       </w:tr>
     </w:tbl>
@@ -15012,7 +15729,7 @@
         <w:color w:val="646464"/>
         <w:sz w:val="18"/>
       </w:rPr>
-      <w:t xml:space="preserve">PVMath Engineering Reference Manual (Public)  ·  v1.0  ·  Page </w:t>
+      <w:t xml:space="preserve">PVMath Engineering Reference Manual (Public)  ·  v1.1  ·  Page </w:t>
       <w:fldChar w:fldCharType="begin"/>
       <w:instrText xml:space="preserve"> PAGE </w:instrText>
       <w:fldChar w:fldCharType="separate"/>

</xml_diff>